<commit_message>
fix: restore English senge alarm-template bullet
</commit_message>
<xml_diff>
--- a/Daopin-Fu-Senior-Java-Engineer.docx
+++ b/Daopin-Fu-Senior-Java-Engineer.docx
@@ -3328,7 +3328,7 @@
           <w:color w:val="11181C"/>
           <w:sz w:val="17"/>
         </w:rPr>
-        <w:t>Netty/WebSocket session management, heartbeats, and exponential reconnect with snapshot catch-up.</w:t>
+        <w:t>Netty/WebSocket sessions, heartbeats, and exponential reconnect with snapshot catch-up.</w:t>
       </w:r>
     </w:p>
     <w:p>
@@ -3373,7 +3373,7 @@
           <w:color w:val="11181C"/>
           <w:sz w:val="17"/>
         </w:rPr>
-        <w:t>Remote-control commands carry sequence, signature, and a distributed lock; timeout rolls back so pump/valve commands cannot replay.</w:t>
+        <w:t>Remote-control uses sequence, signature, and lock; timeout rolls back to block pump/valve replay.</w:t>
       </w:r>
     </w:p>
     <w:p>
@@ -3388,7 +3388,7 @@
           <w:color w:val="11181C"/>
           <w:sz w:val="17"/>
         </w:rPr>
-        <w:t>Heartbeats and incremental catch-up restore dashboards after jitter.</w:t>
+        <w:t>Heartbeats and catch-up restore dashboards after jitter.</w:t>
       </w:r>
     </w:p>
     <w:p>
@@ -3403,7 +3403,22 @@
           <w:color w:val="11181C"/>
           <w:sz w:val="17"/>
         </w:rPr>
-        <w:t>Gateway cluster routes sessions in Redis so reconnects land on the node that holds the snapshot.</w:t>
+        <w:t>Redis routes reconnects to the gateway node holding the session snapshot.</w:t>
+      </w:r>
+    </w:p>
+    <w:p>
+      <w:pPr>
+        <w:pStyle w:val="ListBullet"/>
+        <w:keepLines/>
+      </w:pPr>
+      <w:r>
+        <w:rPr>
+          <w:rFonts w:ascii="Microsoft YaHei" w:hAnsi="Microsoft YaHei" w:eastAsia="Microsoft YaHei"/>
+          <w:b w:val="0"/>
+          <w:color w:val="11181C"/>
+          <w:sz w:val="17"/>
+        </w:rPr>
+        <w:t>Version alarm templates by device type and threshold so field edits do not break the push channel.</w:t>
       </w:r>
     </w:p>
     <w:p>

</xml_diff>